<commit_message>
Convert manuscript to IJSSC format: cut to <6,000 words, Sage Vancouver refs
- Methods 2,084->1,529 w (extended detail moved to new 15_supplementary_methods.md)
- Discussion 2,702->2,041 w (SDT paragraph dropped, sections compressed)
- Results 1,526->1,279 w (KM folded into 3.2, sections renumbered 3.3-3.10)
- Intro 1,087->994 w (SDT/algorithm/triangulation sentences out)
- References pruned 48->35 (6 to supplementary-only, 7 dropped)
- Unstructured abstract, SAGE Statements and Declarations, IJSSC cover letter
- New convert_to_vancouver.py -> MANUSCRIPT_IJSSC.md/.docx (numbered refs)
- Main text 5,680 words, under IJSSC 6,000 limit

Co-Authored-By: Claude Fable 5 <noreply@anthropic.com>
</commit_message>
<xml_diff>
--- a/forskning/ncc-kohort/submission_pse/COVER_LETTER.docx
+++ b/forskning/ncc-kohort/submission_pse/COVER_LETTER.docx
@@ -2,21 +2,44 @@
 <file path=word/document.xml><?xml version="1.0" encoding="utf-8"?>
 <w:document xmlns:w="http://schemas.openxmlformats.org/wordprocessingml/2006/main" xmlns:m="http://schemas.openxmlformats.org/officeDocument/2006/math" xmlns:r="http://schemas.openxmlformats.org/officeDocument/2006/relationships" xmlns:o="urn:schemas-microsoft-com:office:office" xmlns:v="urn:schemas-microsoft-com:vml" xmlns:w10="urn:schemas-microsoft-com:office:word" xmlns:a="http://schemas.openxmlformats.org/drawingml/2006/main" xmlns:pic="http://schemas.openxmlformats.org/drawingml/2006/picture" xmlns:wp="http://schemas.openxmlformats.org/drawingml/2006/wordprocessingDrawing">
   <w:body>
-    <w:bookmarkStart w:id="9" w:name="cover-letter"/>
     <w:p>
       <w:pPr>
-        <w:pStyle w:val="Heading1"/>
-      </w:pPr>
-      <w:r>
-        <w:t xml:space="preserve">Cover Letter</w:t>
+        <w:pStyle w:val="FirstParagraph"/>
+      </w:pPr>
+      <w:r>
+        <w:t xml:space="preserve">Atle Guttormsen, PhD</w:t>
+      </w:r>
+      <w:r>
+        <w:t xml:space="preserve"> </w:t>
+      </w:r>
+      <w:r>
+        <w:t xml:space="preserve">School of Economics and Business</w:t>
+      </w:r>
+      <w:r>
+        <w:t xml:space="preserve"> </w:t>
+      </w:r>
+      <w:r>
+        <w:t xml:space="preserve">Norwegian University of Life Sciences (NMBU)</w:t>
+      </w:r>
+      <w:r>
+        <w:t xml:space="preserve"> </w:t>
+      </w:r>
+      <w:r>
+        <w:t xml:space="preserve">Universitetstunet 3, 1433 Ås, Norway</w:t>
+      </w:r>
+      <w:r>
+        <w:t xml:space="preserve"> </w:t>
+      </w:r>
+      <w:r>
+        <w:t xml:space="preserve">atle.guttormsen@nmbu.no</w:t>
       </w:r>
     </w:p>
     <w:p>
       <w:pPr>
-        <w:pStyle w:val="FirstParagraph"/>
-      </w:pPr>
-      <w:r>
-        <w:t xml:space="preserve">[Date]</w:t>
+        <w:pStyle w:val="BodyText"/>
+      </w:pPr>
+      <w:r>
+        <w:t xml:space="preserve">May 23, 2026</w:t>
       </w:r>
     </w:p>
     <w:p>
@@ -103,7 +126,7 @@
         <w:t xml:space="preserve"> </w:t>
       </w:r>
       <w:r>
-        <w:t xml:space="preserve">The qualitative and survey-based literature has long argued that dropout is a gradual deliberative process rather than a single decision (e.g., Eliasson &amp; Johansson, 2021; Espedalen &amp; Seippel, 2022). Yet the</w:t>
+        <w:t xml:space="preserve">The qualitative and survey-based literature has long argued that dropout is a gradual deliberative process rather than a single decision (Eliasson &amp; Johansson, 2021; Espedalen &amp; Seippel, 2022). Yet the</w:t>
       </w:r>
       <w:r>
         <w:t xml:space="preserve"> </w:t>
@@ -127,7 +150,7 @@
         <w:pStyle w:val="BodyText"/>
       </w:pPr>
       <w:r>
-        <w:t xml:space="preserve">This manuscript uses the Norwegian Athletics Federation’s complete public competition register to bridge that gap. We followed all 2,123 athletes who participated in six consecutive editions of a regional youth track-and-field meet (2011–2016) for up to 14 years, recording each athlete’s annual competition volume, event diversification, championship participation, and Tyrving age-norm performance points. The 14-year follow-up and complete-population design eliminate the recall and selection biases that limit prior dropout research.</w:t>
+        <w:t xml:space="preserve">This manuscript uses the Norwegian Athletics Federation’s complete public competition register to bridge that gap. I followed all 2,123 athletes who participated in six consecutive editions of a regional youth track-and-field meet (2011–2016) for up to 14 years, recording each athlete’s annual competition volume, event diversification, championship participation, and Tyrving age-norm performance. The 14-year follow-up and complete-population design eliminate the recall and selection biases that limit prior dropout research.</w:t>
       </w:r>
     </w:p>
     <w:p>
@@ -155,7 +178,7 @@
         <w:t xml:space="preserve">R</w:t>
       </w:r>
       <w:r>
-        <w:t xml:space="preserve">² doubles from 0.11 to 0.23). Findings replicated across two independent birth-year cohorts (1998–2000 and 2001–2002).</w:t>
+        <w:t xml:space="preserve">² doubled from 0.11 to 0.23). Findings replicated across two independent birth-year cohorts (1998–2000 and 2001–2002).</w:t>
       </w:r>
     </w:p>
     <w:p>
@@ -173,7 +196,7 @@
         <w:t xml:space="preserve"> </w:t>
       </w:r>
       <w:r>
-        <w:t xml:space="preserve">The manuscript is a strong fit for</w:t>
+        <w:t xml:space="preserve">The manuscript fits</w:t>
       </w:r>
       <w:r>
         <w:t xml:space="preserve"> </w:t>
@@ -189,7 +212,7 @@
         <w:t xml:space="preserve"> </w:t>
       </w:r>
       <w:r>
-        <w:t xml:space="preserve">on three grounds. First, the central theoretical scaffolding spans the Sport Commitment Model (Scanlan et al., 1993, 2016) — Scanlan’s SCQ-2 was published in PSE itself — supplemented by Self-determination theory (Ryan &amp; Deci, 2000; Vallerand, 1997, 2007; Sarrazin et al., 2002) and the withdrawal-as-process tradition (Eliasson &amp; Johansson, 2021; Espedalen &amp; Seippel, 2022). Second, the design supplies the kind of</w:t>
+        <w:t xml:space="preserve">on three grounds. First, the theoretical scaffolding spans the Sport Commitment Model (Scanlan et al., 1993, 2016) — Scanlan’s SCQ-2 was published in PSE itself — supplemented by Self-determination theory (Ryan &amp; Deci, 2000; Sarrazin et al., 2002; Vallerand, 2007) and the withdrawal-as-process tradition (Eliasson &amp; Johansson, 2021; Espedalen &amp; Seippel, 2022). Second, the design supplies the kind of</w:t>
       </w:r>
       <w:r>
         <w:t xml:space="preserve"> </w:t>
@@ -205,7 +228,7 @@
         <w:t xml:space="preserve"> </w:t>
       </w:r>
       <w:r>
-        <w:t xml:space="preserve">evidence that has been missing from a literature dominated by cross-sectional surveys and short-prospective designs. Third, the practical implications — that federations and clubs can use register-based behavioral surveillance (positive predictive value ≥ 0.95 across plausible thresholds) to identify athletes at risk of dropout with 2–3 years of lead time — are directly actionable for the applied audiences PSE serves.</w:t>
+        <w:t xml:space="preserve">evidence missing from a literature dominated by cross-sectional surveys and short-prospective designs. Third, the practical implications — federations and clubs can use register-based behavioral surveillance (PPV ≈ 0.94 at a moderate-sensitivity threshold) to identify at-risk athletes years before formal exit — are directly actionable for the applied audiences PSE serves.</w:t>
       </w:r>
     </w:p>
     <w:p>
@@ -223,7 +246,7 @@
         <w:t xml:space="preserve"> </w:t>
       </w:r>
       <w:r>
-        <w:t xml:space="preserve">I have made every effort to anticipate the methodological concerns that arise with observational survival analysis at this scale. The proportional-hazards assumption was tested (Schoenfeld residuals, Table S1) and addressed where violated via period-specific Cox modelling (Table 5). A landmark analysis at age 16 (Table 4) directly tests for measurement-tautology between predictor and outcome — the dominant effect (HR 0.60) survives. The sensitivity of effects to unmeasured confounding is quantified via E-value (E = 5.16 for the primary effect; Table S3). Estimates are robust to outcome definition (Table S9), clustering by club (Table S2), mean-imputation of missing data (Table S5), and exclusion of zero-volume athletes (Table S11). Sample-size sensitivity (Table S4), cross-cohort replication (Table 7), and sex-stratified subgroup analyses (Table S7) confirm the substantive conclusion. The manuscript is written so that the behavioral signal is described as a</w:t>
+        <w:t xml:space="preserve">Every effort has been made to anticipate the methodological concerns that arise with observational survival analysis at this scale. The proportional-hazards assumption was tested via Schoenfeld residuals and addressed where violated by period-specific Cox modelling (Table 5). A landmark analysis at age 16 (Supplementary Table S8) directly tests for measurement overlap between predictor and outcome — the dominant effect (HR = 0.60) survives. Sensitivity to unmeasured confounding is quantified via E-value (E = 5.16). Estimates are robust to outcome definition (Table S9), clustering by club (Table S2), missing-data treatment (Table S5), exclusion of zero-volume athletes (Table S11), cross-cohort replication (Table 7), and sex-stratified subgroup analyses (Table S7). A specialization-vs-performance confound check is reported in Table S18. The behavioral signal is described throughout as a</w:t>
       </w:r>
       <w:r>
         <w:t xml:space="preserve"> </w:t>
@@ -239,7 +262,7 @@
         <w:t xml:space="preserve"> </w:t>
       </w:r>
       <w:r>
-        <w:t xml:space="preserve">of progressive disengagement, not as a direct measurement of motivation or commitment — this is an empirical contribution to a theoretical conversation, not a theoretical claim in itself.</w:t>
+        <w:t xml:space="preserve">of progressive disengagement rather than a direct measurement of motivation — an empirical contribution to a theoretical conversation, not a theoretical claim in itself.</w:t>
       </w:r>
     </w:p>
     <w:p>
@@ -263,7 +286,7 @@
         <w:t xml:space="preserve"> </w:t>
       </w:r>
       <w:r>
-        <w:t xml:space="preserve">“drawing on effects sizes from previous meta-analyses and/or specific papers with designs close to the one authors use.”</w:t>
+        <w:t xml:space="preserve">“drawing on effect sizes from previous meta-analyses and/or specific papers with designs close to the one authors use.”</w:t>
       </w:r>
       <w:r>
         <w:t xml:space="preserve"> </w:t>
@@ -285,7 +308,7 @@
         <w:t xml:space="preserve"> </w:t>
       </w:r>
       <w:r>
-        <w:t xml:space="preserve">— a classical a-priori power calculation is not directly applicable. Methods Section 2.5.4 reframes this requirement as a</w:t>
+        <w:t xml:space="preserve">— a classical a-priori power calculation is not directly applicable. Methods Section 2.5.5 reframes this requirement as a</w:t>
       </w:r>
       <w:r>
         <w:t xml:space="preserve"> </w:t>
@@ -301,7 +324,23 @@
         <w:t xml:space="preserve"> </w:t>
       </w:r>
       <w:r>
-        <w:t xml:space="preserve">analysis: we compute the minimum detectable hazard ratio given the observed event count (Hsieh &amp; Lavori, 2000), benchmark it against effect-size magnitudes typically reported in prior prospective youth-sport dropout research (Sarrazin et al., 2002; Calvo et al., 2010; Espedalen &amp; Seippel, 2022), and show that the design comfortably exceeds those magnitudes (minimum detectable HR ≈ 1.07 vs. typical OR equivalents of 1.4–2.5 in the prior literature). I hope this reframing satisfies the journal’s underlying intent — that the design be capable of detecting theoretically meaningful effects — even though the exact form of a classical a-priori calculation does not transfer to a complete-population design.</w:t>
+        <w:t xml:space="preserve">analysis: the minimum detectable hazard ratio given the observed event count is HR ≈ 1.07 per SD (Hsieh &amp; Lavori, 2000), well below typical effect-size magnitudes in prior prospective youth-sport dropout research (Cohen’s</w:t>
+      </w:r>
+      <w:r>
+        <w:t xml:space="preserve"> </w:t>
+      </w:r>
+      <w:r>
+        <w:rPr>
+          <w:i/>
+          <w:iCs/>
+        </w:rPr>
+        <w:t xml:space="preserve">d</w:t>
+      </w:r>
+      <w:r>
+        <w:t xml:space="preserve"> </w:t>
+      </w:r>
+      <w:r>
+        <w:t xml:space="preserve">≈ 0.2–0.5; ORs ≈ 1.4–2.5; Calvo et al., 2010; Espedalen &amp; Seippel, 2022; Sarrazin et al., 2002). I hope this reframing satisfies the journal’s underlying intent that the design be capable of detecting theoretically meaningful effects.</w:t>
       </w:r>
     </w:p>
     <w:p>
@@ -313,21 +352,13 @@
           <w:b/>
           <w:bCs/>
         </w:rPr>
-        <w:t xml:space="preserve">Compliance and length.</w:t>
-      </w:r>
-      <w:r>
-        <w:t xml:space="preserve"> </w:t>
-      </w:r>
-      <w:r>
-        <w:t xml:space="preserve">The main manuscript runs approximately 7,000 words plus a 1,400-word reference list, with seven main tables and three figures. Including references the total is approximately 8,500 words — modestly above the journal’s 8,000-word target. I respectfully request consideration of this length on the grounds that the additional words are concentrated in (i) methodological rigor anticipating reviewer concerns (landmark analysis, pull-back vs typology decomposition, E-value, calibration, structural controls, detection-capacity benchmarking) and (ii) theoretical triangulation that establishes the contribution. Seventeen supplementary tables (S1–S17) and six supplementary figures (S0–S5, including a cohort-construction flow diagram) are housed in supplementary material and do not contribute to main-text length.</w:t>
-      </w:r>
-    </w:p>
-    <w:p>
-      <w:pPr>
-        <w:pStyle w:val="BodyText"/>
-      </w:pPr>
-      <w:r>
-        <w:t xml:space="preserve">Analysis follows STROBE reporting guidance for observational studies (von Elm et al., 2007) and SAGER guidance for sex/gender reporting (Heidari et al., 2016). All data sources are public; no individual is identifiable in the analysis or the manuscript. The submission is prepared for double-anonymized peer review, with the title page submitted separately. Disclosure of generative-AI use in manuscript preparation appears in a dedicated section before the references list, per the journal’s policy. I confirm that the manuscript is not under consideration elsewhere and that I have no competing interests.</w:t>
+        <w:t xml:space="preserve">Compliance.</w:t>
+      </w:r>
+      <w:r>
+        <w:t xml:space="preserve"> </w:t>
+      </w:r>
+      <w:r>
+        <w:t xml:space="preserve">The main manuscript runs approximately 7,700 words including the abstract, references, and the AI declaration, with seven main tables and three figures. This is comfortably within the journal’s 8,000-word target. Eighteen supplementary tables (S1–S18) and six supplementary figures (S0–S5) are housed in supplementary material. Analysis follows STROBE reporting guidance for observational studies (von Elm et al., 2007) and SAGER guidance for sex/gender reporting (Heidari et al., 2016). The underlying competition records are publicly accessible via the Norwegian Athletics Federation’s online register; the derived analysis dataset itself contains personal data (athlete dates of birth) under the EU GDPR and is therefore not publicly redistributable, although the full analysis code will be deposited upon acceptance. No individual is identifiable in the analysis or the manuscript. The submission is prepared for double-anonymized peer review, with the title page submitted separately. Disclosure of generative-AI use in manuscript preparation appears in a dedicated section before the references list, per the journal’s policy. I confirm that the manuscript is not under consideration elsewhere and that I have no competing interests.</w:t>
       </w:r>
     </w:p>
     <w:p>
@@ -376,7 +407,6 @@
         <w:t xml:space="preserve">atle.guttormsen@nmbu.no</w:t>
       </w:r>
     </w:p>
-    <w:bookmarkEnd w:id="9"/>
     <w:sectPr>
       <w:footnotePr>
         <w:numRestart w:val="eachSect"/>

</xml_diff>